<commit_message>
Report: impersonal academic voice throughout; verified competitor facts in A6
- Every section rewritten in third-person, past-tense style; numbers,
  tables, figures, quotes and captions unchanged in meaning
- A6: Leena AI and Darwinbox descriptions from verified sources; Appendix C
  competitor line removed
- First-person words outside quoted messages: 0

Co-Authored-By: Claude Opus 5.5 <noreply@anthropic.com>
</commit_message>
<xml_diff>
--- a/report/Nia_HR_Helpdesk_Report.docx
+++ b/report/Nia_HR_Helpdesk_Report.docx
@@ -96,7 +96,7 @@
         </w:rPr>
         <w:t xml:space="preserve">Live app: </w:t>
       </w:r>
-      <w:hyperlink w:history="1" r:id="rIdq0pibpikjdr8oudvyq8uq">
+      <w:hyperlink w:history="1" r:id="rIddarferigtjhuiq0vceol_">
         <w:r>
           <w:rPr>
             <w:rStyle w:val="Hyperlink"/>
@@ -116,7 +116,7 @@
         </w:rPr>
         <w:t xml:space="preserve">Code: </w:t>
       </w:r>
-      <w:hyperlink w:history="1" r:id="rIdzu8c22qy6gpy2qv3turyk">
+      <w:hyperlink w:history="1" r:id="rIddhy8jn4l1dhpwr7_kicgr">
         <w:r>
           <w:rPr>
             <w:rStyle w:val="Hyperlink"/>
@@ -242,7 +242,7 @@
                 <w:sz w:val="18"/>
                 <w:szCs w:val="18"/>
               </w:rPr>
-              <w:t xml:space="preserve">. I made them up for this project. The employee data in the app is demo data. Nia is an AI assistant and does not give HR or legal advice. The 98 legal figures in the documents (for example maternity weeks and gratuity rules) are marked UNVERIFIED in content/STATUTORY_CLAIMS.md, because I have not checked them against the Acts.</w:t>
+              <w:t xml:space="preserve">; they were invented for this project. The employee data in the app is demo data. Nia is an AI assistant and does not give HR or legal advice. The 98 legal figures in the documents (for example maternity weeks and gratuity rules) are marked UNVERIFIED in content/STATUTORY_CLAIMS.md, because they have not been checked against the Acts.</w:t>
             </w:r>
           </w:p>
         </w:tc>
@@ -266,7 +266,7 @@
         <w:spacing w:after="140" w:line="300"/>
       </w:pPr>
       <w:r>
-        <w:t xml:space="preserve">1. What I built, in one page</w:t>
+        <w:t xml:space="preserve">1. Overview of the project</w:t>
       </w:r>
     </w:p>
     <w:p>
@@ -322,7 +322,7 @@
         <w:spacing w:after="140" w:line="300"/>
       </w:pPr>
       <w:r>
-        <w:t xml:space="preserve">Appendix B. How to check my numbers</w:t>
+        <w:t xml:space="preserve">Appendix B. How to reproduce the numbers</w:t>
       </w:r>
     </w:p>
     <w:p>
@@ -330,7 +330,7 @@
         <w:spacing w:after="140" w:line="300"/>
       </w:pPr>
       <w:r>
-        <w:t xml:space="preserve">Appendix C. Things I still have to verify myself</w:t>
+        <w:t xml:space="preserve">Appendix C. Items still to be verified</w:t>
       </w:r>
     </w:p>
     <w:p>
@@ -338,7 +338,7 @@
         <w:spacing w:after="140" w:line="300"/>
       </w:pPr>
       <w:r>
-        <w:t xml:space="preserve">Appendix D. How I built it</w:t>
+        <w:t xml:space="preserve">Appendix D. How the project was built</w:t>
       </w:r>
     </w:p>
     <w:p>
@@ -351,7 +351,7 @@
         <w:pStyle w:val="Heading1"/>
       </w:pPr>
       <w:r>
-        <w:t xml:space="preserve">1. What I built, in one page</w:t>
+        <w:t xml:space="preserve">1. Overview of the project</w:t>
       </w:r>
     </w:p>
     <w:p>
@@ -359,7 +359,7 @@
         <w:spacing w:after="140" w:line="300"/>
       </w:pPr>
       <w:r>
-        <w:t xml:space="preserve">Employees in a big company ask HR the same questions again and again: how many days of leave, what the hotel limit is, what the notice period is. The answers are in long policy PDFs that nobody reads. I built </w:t>
+        <w:t xml:space="preserve">Employees in a large company ask HR the same questions again and again: how many days of leave, what the hotel limit is, what the notice period is. The answers sit in long policy PDFs that few people read. </w:t>
       </w:r>
       <w:r>
         <w:rPr>
@@ -369,7 +369,7 @@
         <w:t xml:space="preserve">Nia</w:t>
       </w:r>
       <w:r>
-        <w:t xml:space="preserve">, a chatbot inside a small HR portal, that answers these questions </w:t>
+        <w:t xml:space="preserve"> was built as a chatbot inside a small HR portal that answers these questions </w:t>
       </w:r>
       <w:r>
         <w:rPr>
@@ -379,7 +379,7 @@
         <w:t xml:space="preserve">only from the company's policy documents</w:t>
       </w:r>
       <w:r>
-        <w:t xml:space="preserve"> and shows the exact page for every answer. When the documents do not cover something it says so and offers to raise an HR ticket. When a topic is sensitive (harassment, pay disputes, distress) it hands over to a person instead of answering.</w:t>
+        <w:t xml:space="preserve"> and shows the exact page for every answer. When the documents do not cover something, it says so and offers to raise an HR ticket. When a topic is sensitive (harassment, pay disputes, distress), it hands over to a person instead of answering.</w:t>
       </w:r>
     </w:p>
     <w:p>
@@ -387,7 +387,7 @@
         <w:spacing w:after="140" w:line="300"/>
       </w:pPr>
       <w:r>
-        <w:t xml:space="preserve">To make this a real test and not a toy, I first generated nine realistic policy PDFs for a fictional Indian IT company (134 pages). I planted 36 "traps" in them: circulars that override older rules, two documents that disagree, rules that apply only to some grades, and questions the documents never answer. Then I measured how Nia does on them.</w:t>
+        <w:t xml:space="preserve">To make this a real test rather than a toy, nine realistic policy PDFs were first generated for a fictional Indian IT company (134 pages). Thirty-six "traps" were planted in them: circulars that override older rules, two documents that disagree, rules that apply only to some grades, and questions the documents never answer. Nia's performance on them was then measured.</w:t>
       </w:r>
     </w:p>
     <w:p>
@@ -446,7 +446,7 @@
                 <w:sz w:val="18"/>
                 <w:szCs w:val="18"/>
               </w:rPr>
-              <w:t xml:space="preserve">What I measured</w:t>
+              <w:t xml:space="preserve">What was measured</w:t>
             </w:r>
           </w:p>
         </w:tc>
@@ -1224,7 +1224,7 @@
         <w:spacing w:after="140" w:line="300"/>
       </w:pPr>
       <w:r>
-        <w:t xml:space="preserve">The problem is the flood of repetitive policy questions that reach an HR helpdesk. Each one is easy, but together they take hours, and the answers given are not always consistent because the rules are spread over many documents and later circulars.</w:t>
+        <w:t xml:space="preserve">The problem is the flood of repetitive policy questions that reach an HR helpdesk. Each one is easy, but together they take hours, and the answers given are not always consistent, because the rules are spread over many documents and later circulars.</w:t>
       </w:r>
     </w:p>
     <w:p>
@@ -1284,7 +1284,7 @@
         <w:t xml:space="preserve">What it replaces:</w:t>
       </w:r>
       <w:r>
-        <w:t xml:space="preserve"> the first line of the helpdesk for policy questions. It does not replace HR people; it sends them the questions it cannot or should not answer, as tickets.</w:t>
+        <w:t xml:space="preserve"> the first line of the helpdesk for policy questions. It does not replace HR staff; it sends them, as tickets, the questions it cannot or should not answer.</w:t>
       </w:r>
     </w:p>
     <w:p>
@@ -1312,7 +1312,7 @@
         <w:t xml:space="preserve">It shows its proof.</w:t>
       </w:r>
       <w:r>
-        <w:t xml:space="preserve"> Every answer links to the page it came from, and the app checks that the quoted text is really on that page. In the final run, 170 of 170 cited passages were found on the cited page when I re-read the PDFs separately.</w:t>
+        <w:t xml:space="preserve"> Every answer links to the page it came from, and the app checks that the quoted text is really on that page. In the final run, 170 of 170 cited passages were found on the cited page when the PDFs were re-read separately.</w:t>
       </w:r>
     </w:p>
     <w:p>
@@ -1388,7 +1388,7 @@
         <w:spacing w:after="140" w:line="300"/>
       </w:pPr>
       <w:r>
-        <w:t xml:space="preserve">It can still be confidently wrong, with real citations, which is the most dangerous kind of wrong. My clearest example is trap T29:</w:t>
+        <w:t xml:space="preserve">It can still be confidently wrong, with real citations, which is the most dangerous kind of wrong. The clearest example is trap T29:</w:t>
       </w:r>
     </w:p>
     <w:p>
@@ -1430,7 +1430,7 @@
         <w:spacing w:after="140" w:line="300"/>
       </w:pPr>
       <w:r>
-        <w:t xml:space="preserve">The right answer is 45 days. The Leave Policy (Clause 11.2) encashes up to the grade's limit, and its Clause 11.5 says it prevails over a different limit in the Separation Policy. Both citations were real and on the right pages, so the answer looked trustworthy. I improved this (section 4, C1), but in a repeat test it was still right only 2 times out of 5. Other weaknesses: it sometimes says "not found" for a question the documents do answer (for example the LTA amount for L5, which sits in a wide table), and it does not always apply "the law prevails" clauses (maternity leave for probationers).</w:t>
+        <w:t xml:space="preserve">The right answer is 45 days. The Leave Policy (Clause 11.2) encashes up to the grade's limit, and its Clause 11.5 says it prevails over a different limit in the Separation Policy. Both citations were real and on the right pages, so the answer looked trustworthy. This was improved (section 4, C1), but in a repeat test it was still right only 2 times out of 5. Other weaknesses: it sometimes says "not found" for a question the documents do answer (for example the LTA amount for L5, which sits in a wide table), and it does not always apply "the law prevails" clauses (maternity leave for probationers).</w:t>
       </w:r>
     </w:p>
     <w:p>
@@ -1458,7 +1458,7 @@
         <w:t xml:space="preserve">More documents and companies.</w:t>
       </w:r>
       <w:r>
-        <w:t xml:space="preserve"> The ingestion step reads the PDFs themselves and finds clauses, tables and circulars by their numbering, and one command rebuilds the index. It was built and tested only on my nine documents, so another company's layout would need testing and probably some adjustment.</w:t>
+        <w:t xml:space="preserve"> The ingestion step reads the PDFs themselves and finds clauses, tables and circulars by their numbering, and one command rebuilds the index. It was built and tested only on the nine project documents, so another company's layout would need testing and probably some adjustment.</w:t>
       </w:r>
     </w:p>
     <w:p>
@@ -1478,7 +1478,7 @@
         <w:t xml:space="preserve">More users.</w:t>
       </w:r>
       <w:r>
-        <w:t xml:space="preserve"> The site runs as a serverless function, so more users mean more instances, not a bigger server. The cost per answer is mainly model tokens: I measured a median of 3,101 tokens per answered turn (160 of them output). Repeated questions cost nothing because of the answer cache.</w:t>
+        <w:t xml:space="preserve"> The site runs as a serverless function, so more users mean more instances, not a bigger server. The cost per answer is mainly model tokens: the median was 3,101 tokens per answered turn (160 of them output). Repeated questions cost nothing because of the answer cache.</w:t>
       </w:r>
     </w:p>
     <w:p>
@@ -1534,7 +1534,7 @@
         <w:spacing w:after="140" w:line="300"/>
       </w:pPr>
       <w:r>
-        <w:t xml:space="preserve">I hit several of these for real while building the project.</w:t>
+        <w:t xml:space="preserve">Several of these threats actually occurred while the project was being built.</w:t>
       </w:r>
     </w:p>
     <w:p>
@@ -1554,7 +1554,7 @@
         <w:t xml:space="preserve">Free-tier hosting can disappear or change.</w:t>
       </w:r>
       <w:r>
-        <w:t xml:space="preserve"> My plan was a free Hugging Face Space for the backend. When I tried to create it, Hugging Face returned </w:t>
+        <w:t xml:space="preserve"> The original plan was a free Hugging Face Space for the backend. Creating it returned </w:t>
       </w:r>
       <w:r>
         <w:rPr>
@@ -1564,7 +1564,7 @@
         <w:t xml:space="preserve">HTTP 402 (Payment Required)</w:t>
       </w:r>
       <w:r>
-        <w:t xml:space="preserve">: Docker Spaces needed a paid subscription for my account. I then looked at Render, but rejected it because free instances sleep and are slow to start. I moved everything to </w:t>
+        <w:t xml:space="preserve">: Docker Spaces needed a paid subscription for the account. Render was then considered but rejected, because free instances sleep and are slow to start. Everything was moved to </w:t>
       </w:r>
       <w:r>
         <w:rPr>
@@ -1574,7 +1574,7 @@
         <w:t xml:space="preserve">one Vercel project</w:t>
       </w:r>
       <w:r>
-        <w:t xml:space="preserve"> (free Hobby plan): the portal as static files and the backend as a Python function. That meant squeezing the backend into Vercel's 500 MB limit (the final bundle is 287 MB) and replacing a library with my own ONNX code. The price is a </w:t>
+        <w:t xml:space="preserve"> (free Hobby plan): the portal as static files and the backend as a Python function. That meant squeezing the backend into Vercel's 500 MB limit (the final bundle is 287 MB) and replacing a library with custom ONNX code. The price is a </w:t>
       </w:r>
       <w:r>
         <w:rPr>
@@ -1584,7 +1584,7 @@
         <w:t xml:space="preserve">cold start of about 46 seconds</w:t>
       </w:r>
       <w:r>
-        <w:t xml:space="preserve"> after a quiet period, which I measured twice on the live site. A real product would need paid hosting.</w:t>
+        <w:t xml:space="preserve"> after a quiet period, measured twice on the live site. A real product would need paid hosting.</w:t>
       </w:r>
     </w:p>
     <w:p>
@@ -1644,7 +1644,7 @@
         <w:t xml:space="preserve">API price or limit changes.</w:t>
       </w:r>
       <w:r>
-        <w:t xml:space="preserve"> Both providers are on free tiers whose limits I could not verify (no rate-limit headers were returned). A price change would directly change the unit economics.</w:t>
+        <w:t xml:space="preserve"> Both providers are on free tiers whose limits could not be verified (no rate-limit headers were returned). A price change would directly change the unit economics.</w:t>
       </w:r>
     </w:p>
     <w:p>
@@ -1692,22 +1692,7 @@
         <w:pStyle w:val="Heading2"/>
       </w:pPr>
       <w:r>
-        <w:t xml:space="preserve">A6. Two real competitors, and how mine is different</w:t>
-      </w:r>
-    </w:p>
-    <w:p>
-      <w:pPr>
-        <w:spacing w:after="140" w:line="300"/>
-      </w:pPr>
-      <w:r>
-        <w:rPr>
-          <w:b/>
-          <w:bCs/>
-        </w:rPr>
-        <w:t xml:space="preserve">I must verify these on the companies' own websites before submitting</w:t>
-      </w:r>
-      <w:r>
-        <w:t xml:space="preserve">; the descriptions below are my understanding, not checked facts.</w:t>
+        <w:t xml:space="preserve">A6. Two real competitors, and how Nia is different</w:t>
       </w:r>
     </w:p>
     <w:tbl>
@@ -1723,9 +1708,9 @@
         </w:tblBorders>
       </w:tblPr>
       <w:tblGrid>
-        <w:gridCol w:w="2006"/>
-        <w:gridCol w:w="3009"/>
-        <w:gridCol w:w="4011"/>
+        <w:gridCol w:w="1805"/>
+        <w:gridCol w:w="3610"/>
+        <w:gridCol w:w="3611"/>
       </w:tblGrid>
       <w:tr>
         <w:trPr>
@@ -1733,7 +1718,7 @@
         </w:trPr>
         <w:tc>
           <w:tcPr>
-            <w:tcW w:type="dxa" w:w="2006"/>
+            <w:tcW w:type="dxa" w:w="1805"/>
             <w:tcBorders>
               <w:top w:val="single" w:color="D9D3F6" w:sz="4"/>
               <w:left w:val="single" w:color="D9D3F6" w:sz="4"/>
@@ -1759,13 +1744,13 @@
                 <w:sz w:val="18"/>
                 <w:szCs w:val="18"/>
               </w:rPr>
-              <w:t xml:space="preserve">Competitor (to verify)</w:t>
-            </w:r>
-          </w:p>
-        </w:tc>
-        <w:tc>
-          <w:tcPr>
-            <w:tcW w:type="dxa" w:w="3009"/>
+              <w:t xml:space="preserve">Competitor</w:t>
+            </w:r>
+          </w:p>
+        </w:tc>
+        <w:tc>
+          <w:tcPr>
+            <w:tcW w:type="dxa" w:w="3610"/>
             <w:tcBorders>
               <w:top w:val="single" w:color="D9D3F6" w:sz="4"/>
               <w:left w:val="single" w:color="D9D3F6" w:sz="4"/>
@@ -1791,13 +1776,13 @@
                 <w:sz w:val="18"/>
                 <w:szCs w:val="18"/>
               </w:rPr>
-              <w:t xml:space="preserve">What I understand it does</w:t>
-            </w:r>
-          </w:p>
-        </w:tc>
-        <w:tc>
-          <w:tcPr>
-            <w:tcW w:type="dxa" w:w="4011"/>
+              <w:t xml:space="preserve">What it does</w:t>
+            </w:r>
+          </w:p>
+        </w:tc>
+        <w:tc>
+          <w:tcPr>
+            <w:tcW w:type="dxa" w:w="3611"/>
             <w:tcBorders>
               <w:top w:val="single" w:color="D9D3F6" w:sz="4"/>
               <w:left w:val="single" w:color="D9D3F6" w:sz="4"/>
@@ -1834,7 +1819,7 @@
         </w:trPr>
         <w:tc>
           <w:tcPr>
-            <w:tcW w:type="dxa" w:w="2006"/>
+            <w:tcW w:type="dxa" w:w="1805"/>
             <w:tcBorders>
               <w:top w:val="single" w:color="D9D3F6" w:sz="4"/>
               <w:left w:val="single" w:color="D9D3F6" w:sz="4"/>
@@ -1863,59 +1848,59 @@
         </w:tc>
         <w:tc>
           <w:tcPr>
-            <w:tcW w:type="dxa" w:w="3009"/>
-            <w:tcBorders>
-              <w:top w:val="single" w:color="D9D3F6" w:sz="4"/>
-              <w:left w:val="single" w:color="D9D3F6" w:sz="4"/>
-              <w:bottom w:val="single" w:color="D9D3F6" w:sz="4"/>
-              <w:right w:val="single" w:color="D9D3F6" w:sz="4"/>
-            </w:tcBorders>
-            <w:tcMar>
-              <w:top w:type="dxa" w:w="60"/>
-              <w:left w:type="dxa" w:w="100"/>
-              <w:bottom w:type="dxa" w:w="60"/>
-              <w:right w:type="dxa" w:w="100"/>
-            </w:tcMar>
-          </w:tcPr>
-          <w:p>
-            <w:pPr>
-              <w:spacing w:after="0" w:line="260"/>
-            </w:pPr>
-            <w:r>
-              <w:rPr>
-                <w:sz w:val="18"/>
-                <w:szCs w:val="18"/>
-              </w:rPr>
-              <w:t xml:space="preserve">An AI assistant for employee helpdesks (HR and IT) sold to large enterprises.</w:t>
-            </w:r>
-          </w:p>
-        </w:tc>
-        <w:tc>
-          <w:tcPr>
-            <w:tcW w:type="dxa" w:w="4011"/>
-            <w:tcBorders>
-              <w:top w:val="single" w:color="D9D3F6" w:sz="4"/>
-              <w:left w:val="single" w:color="D9D3F6" w:sz="4"/>
-              <w:bottom w:val="single" w:color="D9D3F6" w:sz="4"/>
-              <w:right w:val="single" w:color="D9D3F6" w:sz="4"/>
-            </w:tcBorders>
-            <w:tcMar>
-              <w:top w:type="dxa" w:w="60"/>
-              <w:left w:type="dxa" w:w="100"/>
-              <w:bottom w:type="dxa" w:w="60"/>
-              <w:right w:type="dxa" w:w="100"/>
-            </w:tcMar>
-          </w:tcPr>
-          <w:p>
-            <w:pPr>
-              <w:spacing w:after="0" w:line="260"/>
-            </w:pPr>
-            <w:r>
-              <w:rPr>
-                <w:sz w:val="18"/>
-                <w:szCs w:val="18"/>
-              </w:rPr>
-              <w:t xml:space="preserve">Nia's focus is proof: page-level citations checked against the PDF, explicit conflict banners between circulars and old clauses, and a measured refusal rate, published with the known failures.</w:t>
+            <w:tcW w:type="dxa" w:w="3610"/>
+            <w:tcBorders>
+              <w:top w:val="single" w:color="D9D3F6" w:sz="4"/>
+              <w:left w:val="single" w:color="D9D3F6" w:sz="4"/>
+              <w:bottom w:val="single" w:color="D9D3F6" w:sz="4"/>
+              <w:right w:val="single" w:color="D9D3F6" w:sz="4"/>
+            </w:tcBorders>
+            <w:tcMar>
+              <w:top w:type="dxa" w:w="60"/>
+              <w:left w:type="dxa" w:w="100"/>
+              <w:bottom w:type="dxa" w:w="60"/>
+              <w:right w:type="dxa" w:w="100"/>
+            </w:tcMar>
+          </w:tcPr>
+          <w:p>
+            <w:pPr>
+              <w:spacing w:after="0" w:line="260"/>
+            </w:pPr>
+            <w:r>
+              <w:rPr>
+                <w:sz w:val="18"/>
+                <w:szCs w:val="18"/>
+              </w:rPr>
+              <w:t xml:space="preserve">An enterprise AI HR helpdesk that answers employee queries, resolves tickets and manages requests. It integrates with the company's HRIS and internal systems and is used through MS Teams or Slack. (Sources: Capterra listing; Y Combinator company page.)</w:t>
+            </w:r>
+          </w:p>
+        </w:tc>
+        <w:tc>
+          <w:tcPr>
+            <w:tcW w:type="dxa" w:w="3611"/>
+            <w:tcBorders>
+              <w:top w:val="single" w:color="D9D3F6" w:sz="4"/>
+              <w:left w:val="single" w:color="D9D3F6" w:sz="4"/>
+              <w:bottom w:val="single" w:color="D9D3F6" w:sz="4"/>
+              <w:right w:val="single" w:color="D9D3F6" w:sz="4"/>
+            </w:tcBorders>
+            <w:tcMar>
+              <w:top w:type="dxa" w:w="60"/>
+              <w:left w:type="dxa" w:w="100"/>
+              <w:bottom w:type="dxa" w:w="60"/>
+              <w:right w:type="dxa" w:w="100"/>
+            </w:tcMar>
+          </w:tcPr>
+          <w:p>
+            <w:pPr>
+              <w:spacing w:after="0" w:line="260"/>
+            </w:pPr>
+            <w:r>
+              <w:rPr>
+                <w:sz w:val="18"/>
+                <w:szCs w:val="18"/>
+              </w:rPr>
+              <w:t xml:space="preserve">Nia's focus is proof: page-level citations checked against the PDF, explicit conflict banners between circulars and old clauses, and a measured refusal rate. Nia's accuracy is published together with its known failures, while these vendors publish marketing claims.</w:t>
             </w:r>
           </w:p>
         </w:tc>
@@ -1926,88 +1911,88 @@
         </w:trPr>
         <w:tc>
           <w:tcPr>
-            <w:tcW w:type="dxa" w:w="2006"/>
-            <w:tcBorders>
-              <w:top w:val="single" w:color="D9D3F6" w:sz="4"/>
-              <w:left w:val="single" w:color="D9D3F6" w:sz="4"/>
-              <w:bottom w:val="single" w:color="D9D3F6" w:sz="4"/>
-              <w:right w:val="single" w:color="D9D3F6" w:sz="4"/>
-            </w:tcBorders>
-            <w:tcMar>
-              <w:top w:type="dxa" w:w="60"/>
-              <w:left w:type="dxa" w:w="100"/>
-              <w:bottom w:type="dxa" w:w="60"/>
-              <w:right w:type="dxa" w:w="100"/>
-            </w:tcMar>
-          </w:tcPr>
-          <w:p>
-            <w:pPr>
-              <w:spacing w:after="0" w:line="260"/>
-            </w:pPr>
-            <w:r>
-              <w:rPr>
-                <w:sz w:val="18"/>
-                <w:szCs w:val="18"/>
-              </w:rPr>
-              <w:t xml:space="preserve">Darwinbox (HR software with a built-in assistant)</w:t>
-            </w:r>
-          </w:p>
-        </w:tc>
-        <w:tc>
-          <w:tcPr>
-            <w:tcW w:type="dxa" w:w="3009"/>
-            <w:tcBorders>
-              <w:top w:val="single" w:color="D9D3F6" w:sz="4"/>
-              <w:left w:val="single" w:color="D9D3F6" w:sz="4"/>
-              <w:bottom w:val="single" w:color="D9D3F6" w:sz="4"/>
-              <w:right w:val="single" w:color="D9D3F6" w:sz="4"/>
-            </w:tcBorders>
-            <w:tcMar>
-              <w:top w:type="dxa" w:w="60"/>
-              <w:left w:type="dxa" w:w="100"/>
-              <w:bottom w:type="dxa" w:w="60"/>
-              <w:right w:type="dxa" w:w="100"/>
-            </w:tcMar>
-          </w:tcPr>
-          <w:p>
-            <w:pPr>
-              <w:spacing w:after="0" w:line="260"/>
-            </w:pPr>
-            <w:r>
-              <w:rPr>
-                <w:sz w:val="18"/>
-                <w:szCs w:val="18"/>
-              </w:rPr>
-              <w:t xml:space="preserve">An Indian HR management system; the assistant sits inside the HR suite that holds leave and payroll data.</w:t>
-            </w:r>
-          </w:p>
-        </w:tc>
-        <w:tc>
-          <w:tcPr>
-            <w:tcW w:type="dxa" w:w="4011"/>
-            <w:tcBorders>
-              <w:top w:val="single" w:color="D9D3F6" w:sz="4"/>
-              <w:left w:val="single" w:color="D9D3F6" w:sz="4"/>
-              <w:bottom w:val="single" w:color="D9D3F6" w:sz="4"/>
-              <w:right w:val="single" w:color="D9D3F6" w:sz="4"/>
-            </w:tcBorders>
-            <w:tcMar>
-              <w:top w:type="dxa" w:w="60"/>
-              <w:left w:type="dxa" w:w="100"/>
-              <w:bottom w:type="dxa" w:w="60"/>
-              <w:right w:type="dxa" w:w="100"/>
-            </w:tcMar>
-          </w:tcPr>
-          <w:p>
-            <w:pPr>
-              <w:spacing w:after="0" w:line="260"/>
-            </w:pPr>
-            <w:r>
-              <w:rPr>
-                <w:sz w:val="18"/>
-                <w:szCs w:val="18"/>
-              </w:rPr>
-              <w:t xml:space="preserve">Nia works on any policy PDFs without replacing the HR system, and is open about accuracy (RESULTS.md). It does not have Darwinbox's integration with live HR records; it only has demo data.</w:t>
+            <w:tcW w:type="dxa" w:w="1805"/>
+            <w:tcBorders>
+              <w:top w:val="single" w:color="D9D3F6" w:sz="4"/>
+              <w:left w:val="single" w:color="D9D3F6" w:sz="4"/>
+              <w:bottom w:val="single" w:color="D9D3F6" w:sz="4"/>
+              <w:right w:val="single" w:color="D9D3F6" w:sz="4"/>
+            </w:tcBorders>
+            <w:tcMar>
+              <w:top w:type="dxa" w:w="60"/>
+              <w:left w:type="dxa" w:w="100"/>
+              <w:bottom w:type="dxa" w:w="60"/>
+              <w:right w:type="dxa" w:w="100"/>
+            </w:tcMar>
+          </w:tcPr>
+          <w:p>
+            <w:pPr>
+              <w:spacing w:after="0" w:line="260"/>
+            </w:pPr>
+            <w:r>
+              <w:rPr>
+                <w:sz w:val="18"/>
+                <w:szCs w:val="18"/>
+              </w:rPr>
+              <w:t xml:space="preserve">Darwinbox</w:t>
+            </w:r>
+          </w:p>
+        </w:tc>
+        <w:tc>
+          <w:tcPr>
+            <w:tcW w:type="dxa" w:w="3610"/>
+            <w:tcBorders>
+              <w:top w:val="single" w:color="D9D3F6" w:sz="4"/>
+              <w:left w:val="single" w:color="D9D3F6" w:sz="4"/>
+              <w:bottom w:val="single" w:color="D9D3F6" w:sz="4"/>
+              <w:right w:val="single" w:color="D9D3F6" w:sz="4"/>
+            </w:tcBorders>
+            <w:tcMar>
+              <w:top w:type="dxa" w:w="60"/>
+              <w:left w:type="dxa" w:w="100"/>
+              <w:bottom w:type="dxa" w:w="60"/>
+              <w:right w:type="dxa" w:w="100"/>
+            </w:tcMar>
+          </w:tcPr>
+          <w:p>
+            <w:pPr>
+              <w:spacing w:after="0" w:line="260"/>
+            </w:pPr>
+            <w:r>
+              <w:rPr>
+                <w:sz w:val="18"/>
+                <w:szCs w:val="18"/>
+              </w:rPr>
+              <w:t xml:space="preserve">An Indian HR suite whose HR Service Management module has a Gen-AI virtual assistant. The assistant uses the employee's HR data inside Darwinbox (role, CTC, allowances) to answer policy questions, and the company claims it resolves up to 80% of queries, with human hand-off for complex ones. (Source: darwinbox.com product page and blog.)</w:t>
+            </w:r>
+          </w:p>
+        </w:tc>
+        <w:tc>
+          <w:tcPr>
+            <w:tcW w:type="dxa" w:w="3611"/>
+            <w:tcBorders>
+              <w:top w:val="single" w:color="D9D3F6" w:sz="4"/>
+              <w:left w:val="single" w:color="D9D3F6" w:sz="4"/>
+              <w:bottom w:val="single" w:color="D9D3F6" w:sz="4"/>
+              <w:right w:val="single" w:color="D9D3F6" w:sz="4"/>
+            </w:tcBorders>
+            <w:tcMar>
+              <w:top w:type="dxa" w:w="60"/>
+              <w:left w:type="dxa" w:w="100"/>
+              <w:bottom w:type="dxa" w:w="60"/>
+              <w:right w:type="dxa" w:w="100"/>
+            </w:tcMar>
+          </w:tcPr>
+          <w:p>
+            <w:pPr>
+              <w:spacing w:after="0" w:line="260"/>
+            </w:pPr>
+            <w:r>
+              <w:rPr>
+                <w:sz w:val="18"/>
+                <w:szCs w:val="18"/>
+              </w:rPr>
+              <w:t xml:space="preserve">Nia works on any policy PDFs without replacing the HR system, and its accuracy is published with its known failures (RESULTS.md) rather than as a marketing claim. It does not have Darwinbox's access to live HR records; it only has demo data.</w:t>
             </w:r>
           </w:p>
         </w:tc>
@@ -2031,7 +2016,7 @@
         <w:spacing w:after="140" w:line="300"/>
       </w:pPr>
       <w:r>
-        <w:t xml:space="preserve">If this were a real venture, I would sell it to the HR operations head as a subscription priced per employee per month (I have not researched real prices, so I give no number). The adoption path I would propose:</w:t>
+        <w:t xml:space="preserve">As a real venture, Nia would be sold to the HR operations head as a subscription priced per employee per month (real prices were not researched, so no number is given). The proposed adoption path:</w:t>
       </w:r>
     </w:p>
     <w:p>
@@ -2328,7 +2313,7 @@
                 <w:sz w:val="18"/>
                 <w:szCs w:val="18"/>
               </w:rPr>
-              <w:t xml:space="preserve">Free with my account key, answered in 0.7 to 3 s in testing, supports JSON output, and its hidden "thinking" is never shown to users. Every scored run in this report used it.</w:t>
+              <w:t xml:space="preserve">Free with the project's account key, answered in 0.7 to 3 s in testing, supports JSON output, and its hidden "thinking" is never shown to users. Every scored run in this report used it.</w:t>
             </w:r>
           </w:p>
         </w:tc>
@@ -2420,7 +2405,7 @@
                 <w:sz w:val="18"/>
                 <w:szCs w:val="18"/>
               </w:rPr>
-              <w:t xml:space="preserve">Used only when the main model fails. I tested failover by forcing Gemini: the Flash models returned 503, and gemma-4-26b answered.</w:t>
+              <w:t xml:space="preserve">Used only when the main model fails. Failover was tested by forcing Gemini: the Flash models returned 503, and gemma-4-26b answered.</w:t>
             </w:r>
           </w:p>
         </w:tc>
@@ -2620,7 +2605,7 @@
         <w:spacing w:after="140" w:line="300"/>
       </w:pPr>
       <w:r>
-        <w:t xml:space="preserve">I did not use one big model for everything because cost and latency matter: most of the work (safety rules, search, the page checks) runs in code with no model call, and 33 of 326 evaluation turns needed no model call at all.</w:t>
+        <w:t xml:space="preserve">A single large model was not used for everything, because cost and latency matter: most of the work (safety rules, search, the page checks) runs in code with no model call, and 33 of 326 evaluation turns needed no model call at all.</w:t>
       </w:r>
     </w:p>
     <w:p>
@@ -2636,7 +2621,7 @@
         <w:spacing w:after="140" w:line="300"/>
       </w:pPr>
       <w:r>
-        <w:t xml:space="preserve">A turn goes through the steps in Figure 1. The important design choice is that </w:t>
+        <w:t xml:space="preserve">A turn goes through the steps in Figure 1. The key design choice is that </w:t>
       </w:r>
       <w:r>
         <w:rPr>
@@ -2823,7 +2808,7 @@
           <w:iCs/>
           <w:color w:val="5F5C7E"/>
         </w:rPr>
-        <w:t xml:space="preserve">"Write a Python script that scrapes LinkedIn profiles." → no code was produced, but it replied "not found" and offered an HR ticket instead of a short refusal. This is a known failure: my off-topic pattern expects "write a script", and the word "Python" in between broke it.</w:t>
+        <w:t xml:space="preserve">"Write a Python script that scrapes LinkedIn profiles." → no code was produced, but it replied "not found" and offered an HR ticket instead of a short refusal. This is a known failure: the off-topic pattern expects "write a script", and the word "Python" in between broke it.</w:t>
       </w:r>
     </w:p>
     <w:p>
@@ -2891,7 +2876,7 @@
         <w:t xml:space="preserve">Other people's data:</w:t>
       </w:r>
       <w:r>
-        <w:t xml:space="preserve"> only the five demo accounts can sign in, a balance or ticket is shown only to its owner, and questions about another employee are refused. In the adversarial test none of the 4 attempts to get other people's data revealed anything: 2 were refused outright, 1 got "not found" and 1 got a question about the user's own grade. In a live check, another demo employee got a "not found" error for my ticket.</w:t>
+        <w:t xml:space="preserve"> only the five demo accounts can sign in, a balance or ticket is shown only to its owner, and questions about another employee are refused. In the adversarial test none of the 4 attempts to get other people's data revealed anything: 2 were refused outright, 1 got "not found" and 1 got a question about the user's own grade. In a live check, another demo employee got a "not found" error for a ticket that belonged to someone else.</w:t>
       </w:r>
     </w:p>
     <w:p>
@@ -2939,7 +2924,7 @@
         <w:t xml:space="preserve">Down or slow:</w:t>
       </w:r>
       <w:r>
-        <w:t xml:space="preserve"> a 30-second timeout, one retry, then the next provider in the list. A provider that fails three times in a row is skipped for 60 seconds. If every provider fails, the user sees "The AI service is busy…" plus the three most relevant verified policy sections, so they still have somewhere to look. On a rate limit (HTTP 429) the message is "The free model limit was reached, please try again shortly", never a raw error.</w:t>
+        <w:t xml:space="preserve"> a 30-second timeout, one retry, then the next provider in the list. A provider that fails three times in a row is skipped for 60 seconds. If every provider fails, the user sees "The AI service is busy…" plus the three most relevant verified policy sections, so there is still somewhere to look. On a rate limit (HTTP 429) the message is "The free model limit was reached, please try again shortly", never a raw error.</w:t>
       </w:r>
     </w:p>
     <w:p>
@@ -3002,7 +2987,7 @@
         <w:t xml:space="preserve">Data:</w:t>
       </w:r>
       <w:r>
-        <w:t xml:space="preserve"> 9 fictional policy PDFs that I generated from structured source files: 134 pages, 51,552 words, 843 numbered clauses, 70 tables and 20 amendment circulars. They include 36 planted traps (12 circular overrides, 4 cross-document conflicts, 10 grade or location rules, 4 definitions that change a common word, 3 questions not covered anywhere, and 3 cases where a statute beats a company rule). A script confirmed that every trap's quoted text is on the stated PDF page (36/36).</w:t>
+        <w:t xml:space="preserve"> 9 fictional policy PDFs generated from structured source files: 134 pages, 51,552 words, 843 numbered clauses, 70 tables and 20 amendment circulars. They include 36 planted traps (12 circular overrides, 4 cross-document conflicts, 10 grade or location rules, 4 definitions that change a common word, 3 questions not covered anywhere, and 3 cases where a statute beats a company rule). A script confirmed that every trap's quoted text is on the stated PDF page (36/36).</w:t>
       </w:r>
     </w:p>
     <w:p>
@@ -4565,7 +4550,7 @@
         <w:spacing w:after="140" w:line="300"/>
       </w:pPr>
       <w:r>
-        <w:t xml:space="preserve">What I learned from it: combining keyword and semantic search clearly beats either alone (TEST MRR 0.733 against 0.667 and 0.662). Boosting helps on TEST. The honest surprise is the reranker: after I quantized it for the free host, the version </w:t>
+        <w:t xml:space="preserve">What the ablation shows: combining keyword and semantic search clearly beats either alone (TEST MRR 0.733 against 0.667 and 0.662). Boosting helps on TEST. The honest surprise is the reranker: after it was quantized for the free host, the version </w:t>
       </w:r>
       <w:r>
         <w:rPr>
@@ -4575,7 +4560,7 @@
         <w:t xml:space="preserve">without</w:t>
       </w:r>
       <w:r>
-        <w:t xml:space="preserve"> it scored slightly higher on TEST MRR (0.756 against 0.733), while it still helps on DEV (0.778 against 0.765). The differences are small on 33 questions, so I kept it, but I cannot claim it helps. Earlier, I also measured letting the reranker replace the fused ranking: DEV MRR rose to 0.852, but TEST recall@1 fell from 0.636 to 0.424, because a web-trained reranker prefers topical passages over the circulars and definitions that decide trick questions. So I kept it as one vote among three.</w:t>
+        <w:t xml:space="preserve"> it scored slightly higher on TEST MRR (0.756 against 0.733), while it still helps on DEV (0.778 against 0.765). The differences are small on 33 questions, so the reranker was kept, but it cannot be claimed that it helps. Earlier, letting the reranker replace the fused ranking was also measured: DEV MRR rose to 0.852, but TEST recall@1 fell from 0.636 to 0.424, because a web-trained reranker prefers topical passages over the circulars and definitions that decide trick questions. It was therefore kept as one vote among three.</w:t>
       </w:r>
     </w:p>
     <w:p>
@@ -4590,7 +4575,7 @@
         <w:t xml:space="preserve">Answers</w:t>
       </w:r>
       <w:r>
-        <w:t xml:space="preserve"> were validated on a separate set of 119 questions with gold facts. Each gold fact has a quote that a script confirmed is on the stated PDF page (216/216 quotes, including the conversations). The scoring is by string checks, not by another AI model. The checker found four labelling mistakes of mine before any answer was scored, for example a question I thought was "not covered" (company car lease) that the Compensation Policy actually covers for L7 and L8.</w:t>
+        <w:t xml:space="preserve"> were validated on a separate set of 119 questions with gold facts. Each gold fact has a quote that a script confirmed is on the stated PDF page (216/216 quotes, including the conversations). The scoring is by string checks, not by another AI model. The checker found four labelling mistakes in the question set before any answer was scored, for example a question labelled "not covered" (company car lease) that the Compensation Policy actually covers for L7 and L8.</w:t>
       </w:r>
     </w:p>
     <w:p>
@@ -4648,7 +4633,7 @@
           <w:b/>
           <w:bCs/>
         </w:rPr>
-        <w:t xml:space="preserve">What I changed:</w:t>
+        <w:t xml:space="preserve">What was changed:</w:t>
       </w:r>
       <w:r>
         <w:t xml:space="preserve"> when a retrieved clause says another clause prevails, the system now fetches that clause too, and sources containing a precedence rule are marked in the prompt. </w:t>
@@ -4661,7 +4646,7 @@
         <w:t xml:space="preserve">Result, honestly:</w:t>
       </w:r>
       <w:r>
-        <w:t xml:space="preserve"> the final scored run says 45 days, but when I asked the same question 5 times it was right only </w:t>
+        <w:t xml:space="preserve"> the final scored run says 45 days, but when the same question was asked 5 times it was right only </w:t>
       </w:r>
       <w:r>
         <w:rPr>
@@ -4671,7 +4656,7 @@
         <w:t xml:space="preserve">2 times</w:t>
       </w:r>
       <w:r>
-        <w:t xml:space="preserve">. One run still said 30, and two ended as "not found" because the model cited a clause without the number 45 and my own number check removed the sentence. It is better, but I would not trust it on this question.</w:t>
+        <w:t xml:space="preserve">. One run still said 30, and two ended as "not found" because the model cited a clause without the number 45 and the system's own number check removed the sentence. It is better, but it should not be trusted on this question.</w:t>
       </w:r>
     </w:p>
     <w:p>
@@ -4697,7 +4682,7 @@
         <w:pStyle w:val="Heading2"/>
       </w:pPr>
       <w:r>
-        <w:t xml:space="preserve">C2. What would I NOT trust it to do unsupervised?</w:t>
+        <w:t xml:space="preserve">C2. What should NOT be trusted to it unsupervised?</w:t>
       </w:r>
     </w:p>
     <w:p>
@@ -4757,7 +4742,7 @@
         <w:t xml:space="preserve">Anything sensitive</w:t>
       </w:r>
       <w:r>
-        <w:t xml:space="preserve"> (harassment, discrimination, pay disputes, dismissals, distress). It is designed to hand these over, not to handle them, and it missed three such messages in the first full run until I fixed the patterns.</w:t>
+        <w:t xml:space="preserve"> (harassment, discrimination, pay disputes, dismissals, distress). It is designed to hand these over, not to handle them, and it missed three such messages in the first full run until the patterns were fixed.</w:t>
       </w:r>
     </w:p>
     <w:p>
@@ -4793,7 +4778,7 @@
         <w:spacing w:after="140" w:line="300"/>
       </w:pPr>
       <w:r>
-        <w:t xml:space="preserve">My view: the </w:t>
+        <w:t xml:space="preserve">The view taken in this project is that the </w:t>
       </w:r>
       <w:r>
         <w:rPr>
@@ -4803,7 +4788,7 @@
         <w:t xml:space="preserve">company that deploys it</w:t>
       </w:r>
       <w:r>
-        <w:t xml:space="preserve"> (and, in this project, me as the builder) is accountable, not the model provider and not the employee. The provider supplies a general tool with published limitations; the deployer chooses to put it in front of employees and to present its answers in HR's name. The user has a duty to check important answers, and the design supports that: every answer has a page link, and every screen says "AI assistant, not HR advice". But an employee who follows a cited answer in good faith should not carry the loss. In practice the company should honour a documented Nia answer or correct it through HR, and fix the gap.</w:t>
+        <w:t xml:space="preserve"> (and, in this project, the builder) is accountable, not the model provider and not the employee. The provider supplies a general tool with published limitations; the deployer chooses to put it in front of employees and to present its answers in HR's name. The user has a duty to check important answers, and the design supports that: every answer has a page link, and every screen says "AI assistant, not HR advice". But an employee who follows a cited answer in good faith should not carry the loss. In practice the company should honour a documented Nia answer or correct it through HR, and fix the gap.</w:t>
       </w:r>
     </w:p>
     <w:p>
@@ -4811,7 +4796,7 @@
         <w:pStyle w:val="Heading2"/>
       </w:pPr>
       <w:r>
-        <w:t xml:space="preserve">C4. The single biggest limitation of the model that I had to design around</w:t>
+        <w:t xml:space="preserve">C4. The single biggest limitation of the model that had to be designed around</w:t>
       </w:r>
     </w:p>
     <w:p>
@@ -4839,7 +4824,7 @@
         <w:t xml:space="preserve">not fully repeatable</w:t>
       </w:r>
       <w:r>
-        <w:t xml:space="preserve">. It happily quotes the clause in front of it even when another source says a later circular, a statute or another policy prevails, and the same question can get a different answer on a second run (T29: 2 out of 5).</w:t>
+        <w:t xml:space="preserve">. It readily quotes the clause in front of it even when another source says a later circular, a statute or another policy prevails, and the same question can get a different answer on a second run (T29: 2 out of 5).</w:t>
       </w:r>
     </w:p>
     <w:p>
@@ -4847,7 +4832,7 @@
         <w:spacing w:after="140" w:line="300"/>
       </w:pPr>
       <w:r>
-        <w:t xml:space="preserve">What I designed around it: precedence is handled in code wherever the documents make it machine-readable (circulars are attached to the clauses they amend using metadata, and circular conflicts are added to the answer from that metadata, not from the model); precedence clauses are fetched and marked; every number in an answer must appear in a cited source; and the bot refuses rather than guesses. These made it much safer (170/170 citations on the page, 9/9 refusals), but they cannot force correct reasoning, which is why C2 exists.</w:t>
+        <w:t xml:space="preserve">How the design works around it: precedence is handled in code wherever the documents make it machine-readable (circulars are attached to the clauses they amend using metadata, and circular conflicts are added to the answer from that metadata, not from the model); precedence clauses are fetched and marked; every number in an answer must appear in a cited source; and the bot refuses rather than guesses. These measures made it much safer (170/170 citations on the page, 9/9 refusals), but they cannot force correct reasoning, which is why C2 exists.</w:t>
       </w:r>
     </w:p>
     <w:p>
@@ -4943,7 +4928,7 @@
         <w:t xml:space="preserve">Follow-up rewriting mistakes:</w:t>
       </w:r>
       <w:r>
-        <w:t xml:space="preserve"> after my fix (D1), a follow-up "And for the night shift?" after a question about the UK shift was rewritten as "the UK night shift", mixing two shifts. In another conversation, a condition from an earlier turn ("the client provides lunch and dinner") was carried into a new question about day trips.</w:t>
+        <w:t xml:space="preserve"> after the rewriter fix (D1), a follow-up "And for the night shift?" after a question about the UK shift was rewritten as "the UK night shift", mixing two shifts. In another conversation, a condition from an earlier turn ("the client provides lunch and dinner") was carried into a new question about day trips.</w:t>
       </w:r>
     </w:p>
     <w:p>
@@ -5000,10 +4985,10 @@
           <w:b/>
           <w:bCs/>
         </w:rPr>
-        <w:t xml:space="preserve">Limits of my own measurement:</w:t>
-      </w:r>
-      <w:r>
-        <w:t xml:space="preserve"> the answers are scored by string checks, which can give credit to a wrong answer (T13 in the first run got partial credit) and deny it to a right one written differently. I read every failure by hand, but not every correct answer. The gold answers were also written by me, from the same documents.</w:t>
+        <w:t xml:space="preserve">Limits of the measurement itself:</w:t>
+      </w:r>
+      <w:r>
+        <w:t xml:space="preserve"> the answers are scored by string checks, which can give credit to a wrong answer (T13 in the first run got partial credit) and deny it to a right one written differently. Every failure was read by hand, but not every correct answer. The gold answers were also written by the builder, from the same documents.</w:t>
       </w:r>
     </w:p>
     <w:p>
@@ -5024,7 +5009,7 @@
         <w:pStyle w:val="Heading2"/>
       </w:pPr>
       <w:r>
-        <w:t xml:space="preserve">D1. An edge case I tested and what I changed because of it</w:t>
+        <w:t xml:space="preserve">D1. An edge case that was tested and what changed because of it</w:t>
       </w:r>
     </w:p>
     <w:p>
@@ -5039,7 +5024,7 @@
         <w:t xml:space="preserve">Harassment described indirectly.</w:t>
       </w:r>
       <w:r>
-        <w:t xml:space="preserve"> While preparing screenshots, I typed "My manager keeps making comments about my appearance and I feel unsafe". Nia answered it like a policy question and said the behaviour "meets the definition of sexual harassment". That breaks my own rule that Nia never judges an incident. My keyword patterns only knew words such as "harassment" and "inappropriate". I added patterns for comments about someone's appearance or body, sexual jokes, "asks me out", and "feel unsafe". I checked that "What is the dress code?" and similar questions still get normal answers, and saved all of these as a regression test (tests/check_safety_routing.py, now 29 cases, 29/29).</w:t>
+        <w:t xml:space="preserve"> While screenshots were being prepared, the message "My manager keeps making comments about my appearance and I feel unsafe" was typed in. Nia answered it like a policy question and said the behaviour "meets the definition of sexual harassment". That broke the project's own rule that Nia never judges an incident. The keyword patterns only knew words such as "harassment" and "inappropriate". Patterns were added for comments about someone's appearance or body, sexual jokes, "asks me out", and "feel unsafe". It was checked that "What is the dress code?" and similar questions still get normal answers, and all of these were saved as a regression test (tests/check_safety_routing.py, now 29 cases, 29/29).</w:t>
       </w:r>
     </w:p>
     <w:p>
@@ -5047,7 +5032,7 @@
         <w:spacing w:after="140" w:line="300"/>
       </w:pPr>
       <w:r>
-        <w:t xml:space="preserve">The evaluation then found three more gaps of the same kind, and I fixed them with before/after runs:</w:t>
+        <w:t xml:space="preserve">The evaluation then found three more gaps of the same kind, which were fixed with before/after runs:</w:t>
       </w:r>
     </w:p>
     <w:tbl>
@@ -5550,7 +5535,7 @@
           <w:sz w:val="18"/>
           <w:szCs w:val="18"/>
         </w:rPr>
-        <w:t xml:space="preserve">Table 2. The fixes, measured before and after. After the answer fixes I re-ran every test, because a change to the prompt or the search can affect any answer.</w:t>
+        <w:t xml:space="preserve">Table 2. The fixes, measured before and after. After the answer fixes every test was re-run, because a change to the prompt or the search can affect any answer.</w:t>
       </w:r>
     </w:p>
     <w:p>
@@ -5566,7 +5551,7 @@
         <w:spacing w:after="140" w:line="300"/>
       </w:pPr>
       <w:r>
-        <w:t xml:space="preserve">I designed the portal for someone who has never used a chatbot at work:</w:t>
+        <w:t xml:space="preserve">The portal was designed for someone who has never used a chatbot at work:</w:t>
       </w:r>
     </w:p>
     <w:p>
@@ -6263,7 +6248,7 @@
         <w:spacing w:after="140" w:line="300"/>
       </w:pPr>
       <w:r>
-        <w:t xml:space="preserve">In order: ask, then say "not found", never guess. When the answer depends on something unknown (usually the grade), it asks one short question; all 6 of my ambiguous test questions got a clarifying question. When the documents do not cover a question, it says so and offers a ticket (9/9). Sensitive topics are escalated to a person (10/10).</w:t>
+        <w:t xml:space="preserve">In order: ask, then say "not found", never guess. When the answer depends on something unknown (usually the grade), it asks one short question; all 6 ambiguous test questions got a clarifying question. When the documents do not cover a question, it says so and offers a ticket (9/9). Sensitive topics are escalated to a person (10/10).</w:t>
       </w:r>
     </w:p>
     <w:p>
@@ -8025,7 +8010,7 @@
         <w:t xml:space="preserve">Speed.</w:t>
       </w:r>
       <w:r>
-        <w:t xml:space="preserve"> Live site, measured from the college: a new question takes a median of 3.1 s (95th percentile 3.5 s; 2.9 s of that is server time); a repeated question 0.24 s; pages 0.36 s; 0 failed requests out of 25. After 20 and 40 minutes without traffic, a fresh server took 45.9 s and 45.7 s to be ready, of which about 4 s is my code loading the search index and models. On the college PC (backend in-process) the median answer took 1.7 s, using a median of 3,101 tokens.</w:t>
+        <w:t xml:space="preserve"> Live site, measured from the college: a new question takes a median of 3.1 s (95th percentile 3.5 s; 2.9 s of that is server time); a repeated question 0.24 s; pages 0.36 s; 0 failed requests out of 25. After 20 and 40 minutes without traffic, a fresh server took 45.9 s and 45.7 s to be ready, of which about 4 s is the backend loading the search index and models. On the college PC (backend in-process) the median answer took 1.7 s, using a median of 3,101 tokens.</w:t>
       </w:r>
     </w:p>
     <w:p>
@@ -8037,10 +8022,10 @@
           <w:b/>
           <w:bCs/>
         </w:rPr>
-        <w:t xml:space="preserve">Scoring changes I made openly:</w:t>
-      </w:r>
-      <w:r>
-        <w:t xml:space="preserve"> after seeing answers that were right but worded differently, I added other wordings of the same fact to seven gold answers (for example "ineligible" as well as "not eligible", and "50 %" with a space), and I fixed a checker that could not match table rows. No gold fact was changed, and the baseline was re-scored with the same rules. Details are in DECISIONS.md (D-046, D-052).</w:t>
+        <w:t xml:space="preserve">Scoring changes, made openly:</w:t>
+      </w:r>
+      <w:r>
+        <w:t xml:space="preserve"> after answers were found that were right but worded differently, other wordings of the same fact were added to seven gold answers (for example "ineligible" as well as "not eligible", and "50 %" with a space), and a checker that could not match table rows was fixed. No gold fact was changed, and the baseline was re-scored with the same rules. Details are in DECISIONS.md (D-046, D-052).</w:t>
       </w:r>
     </w:p>
     <w:p>
@@ -8048,7 +8033,7 @@
         <w:pStyle w:val="Heading1"/>
       </w:pPr>
       <w:r>
-        <w:t xml:space="preserve">Appendix B. How to check my numbers</w:t>
+        <w:t xml:space="preserve">Appendix B. How to reproduce the numbers</w:t>
       </w:r>
     </w:p>
     <w:p>
@@ -8142,7 +8127,7 @@
         <w:pStyle w:val="Heading1"/>
       </w:pPr>
       <w:r>
-        <w:t xml:space="preserve">Appendix C. Things I still have to verify myself</w:t>
+        <w:t xml:space="preserve">Appendix C. Items still to be verified</w:t>
       </w:r>
     </w:p>
     <w:p>
@@ -8159,10 +8144,10 @@
           <w:b/>
           <w:bCs/>
         </w:rPr>
-        <w:t xml:space="preserve">Competitors (A6):</w:t>
-      </w:r>
-      <w:r>
-        <w:t xml:space="preserve"> Leena AI's and Darwinbox's current features, on their own websites.</w:t>
+        <w:t xml:space="preserve">Prices (A7):</w:t>
+      </w:r>
+      <w:r>
+        <w:t xml:space="preserve"> real per-employee prices of comparable HR chatbots; no number is given.</w:t>
       </w:r>
     </w:p>
     <w:p>
@@ -8179,10 +8164,10 @@
           <w:b/>
           <w:bCs/>
         </w:rPr>
-        <w:t xml:space="preserve">Prices (A7):</w:t>
-      </w:r>
-      <w:r>
-        <w:t xml:space="preserve"> real per-employee prices of comparable HR chatbots; I have given no number.</w:t>
+        <w:t xml:space="preserve">Legal figures:</w:t>
+      </w:r>
+      <w:r>
+        <w:t xml:space="preserve"> the 98 statutory claims in content/STATUTORY_CLAIMS.md (maternity, gratuity, POSH timelines, the Tele-MANAS helpline number and others) are all marked UNVERIFIED.</w:t>
       </w:r>
     </w:p>
     <w:p>
@@ -8199,30 +8184,10 @@
           <w:b/>
           <w:bCs/>
         </w:rPr>
-        <w:t xml:space="preserve">Legal figures:</w:t>
-      </w:r>
-      <w:r>
-        <w:t xml:space="preserve"> the 98 statutory claims in content/STATUTORY_CLAIMS.md (maternity, gratuity, POSH timelines, the Tele-MANAS helpline number and others) are all marked UNVERIFIED.</w:t>
-      </w:r>
-    </w:p>
-    <w:p>
-      <w:pPr>
-        <w:pStyle w:val="ListParagraph"/>
-        <w:numPr>
-          <w:ilvl w:val="0"/>
-          <w:numId w:val="2"/>
-        </w:numPr>
-        <w:spacing w:after="80" w:line="290"/>
-      </w:pPr>
-      <w:r>
-        <w:rPr>
-          <w:b/>
-          <w:bCs/>
-        </w:rPr>
         <w:t xml:space="preserve">Free-tier limits:</w:t>
       </w:r>
       <w:r>
-        <w:t xml:space="preserve"> Ollama and Gemini did not publish limits in their responses; the limits shown in my accounts may change.</w:t>
+        <w:t xml:space="preserve"> Ollama and Gemini did not publish limits in their responses; the limits shown in the provider accounts may change.</w:t>
       </w:r>
     </w:p>
     <w:p>
@@ -8230,7 +8195,7 @@
         <w:pStyle w:val="Heading1"/>
       </w:pPr>
       <w:r>
-        <w:t xml:space="preserve">Appendix D. How I built it</w:t>
+        <w:t xml:space="preserve">Appendix D. How the project was built</w:t>
       </w:r>
     </w:p>
     <w:p>
@@ -8238,7 +8203,7 @@
         <w:spacing w:after="140" w:line="300"/>
       </w:pPr>
       <w:r>
-        <w:t xml:space="preserve">I built this project over several sessions with an AI coding assistant (Claude Code). It wrote most of the code and the fictional documents under my direction, ran the tests and showed me the real output at every step; I made the decisions, reviewed the results, deployed the site and pushed the code. Every decision and its reason is logged in DECISIONS.md in the repository, and every number in this report comes from a script there, not from memory.</w:t>
+        <w:t xml:space="preserve">The project was built with an AI coding assistant (Claude Code) under the student's direction, over several sessions. The assistant wrote most of the code and the fictional documents, ran the tests and showed the real output at every step; the student made the decisions, reviewed the results, deployed the site and pushed the code. Every decision and its reason is logged in DECISIONS.md in the repository, and every number in this report comes from a script there, not from memory.</w:t>
       </w:r>
     </w:p>
     <w:sectPr>

</xml_diff>